<commit_message>
Cambios logic para hacer pruebas, excel y el docs
</commit_message>
<xml_diff>
--- a/Docs/Observaciones-Lab6.docx
+++ b/Docs/Observaciones-Lab6.docx
@@ -79,7 +79,21 @@
           <w:noProof w:val="0"/>
           <w:lang w:val="es-CO"/>
         </w:rPr>
-        <w:t>Estudiante 2 Cod XXXX</w:t>
+        <w:t>Jimmy Alejandro Mujica Delgado</w:t>
+      </w:r>
+      <w:r>
+        <w:rPr>
+          <w:noProof w:val="0"/>
+          <w:lang w:val="es-CO"/>
+        </w:rPr>
+        <w:t xml:space="preserve"> Cod </w:t>
+      </w:r>
+      <w:r>
+        <w:rPr>
+          <w:noProof w:val="0"/>
+          <w:lang w:val="es-CO"/>
+        </w:rPr>
+        <w:t>202224528</w:t>
       </w:r>
     </w:p>
     <w:p>
@@ -96,21 +110,21 @@
           <w:noProof w:val="0"/>
           <w:lang w:val="es-CO"/>
         </w:rPr>
-        <w:t xml:space="preserve">Estudiante </w:t>
+        <w:t>Samuel Esteban Diaz</w:t>
       </w:r>
       <w:r>
         <w:rPr>
           <w:noProof w:val="0"/>
           <w:lang w:val="es-CO"/>
         </w:rPr>
-        <w:t>3</w:t>
+        <w:t xml:space="preserve"> Cod </w:t>
       </w:r>
       <w:r>
         <w:rPr>
           <w:noProof w:val="0"/>
           <w:lang w:val="es-CO"/>
         </w:rPr>
-        <w:t xml:space="preserve"> Cod XXXX</w:t>
+        <w:t>202522112</w:t>
       </w:r>
     </w:p>
     <w:p>
@@ -215,13 +229,104 @@
           <w:tcPr>
             <w:tcW w:w="3525" w:type="pct"/>
           </w:tcPr>
+          <w:tbl>
+            <w:tblPr>
+              <w:tblW w:w="0" w:type="auto"/>
+              <w:tblCellSpacing w:w="15" w:type="dxa"/>
+              <w:tblCellMar>
+                <w:top w:w="15" w:type="dxa"/>
+                <w:left w:w="15" w:type="dxa"/>
+                <w:bottom w:w="15" w:type="dxa"/>
+                <w:right w:w="15" w:type="dxa"/>
+              </w:tblCellMar>
+              <w:tblLook w:val="04A0" w:firstRow="1" w:lastRow="0" w:firstColumn="1" w:lastColumn="0" w:noHBand="0" w:noVBand="1"/>
+            </w:tblPr>
+            <w:tblGrid>
+              <w:gridCol w:w="81"/>
+              <w:gridCol w:w="3808"/>
+            </w:tblGrid>
+            <w:tr>
+              <w:trPr>
+                <w:tblCellSpacing w:w="15" w:type="dxa"/>
+              </w:trPr>
+              <w:tc>
+                <w:tcPr>
+                  <w:tcW w:w="0" w:type="auto"/>
+                  <w:vAlign w:val="center"/>
+                  <w:hideMark/>
+                </w:tcPr>
+                <w:p>
+                  <w:pPr>
+                    <w:spacing w:after="0" w:line="240" w:lineRule="auto"/>
+                    <w:rPr>
+                      <w:rFonts w:ascii="Times New Roman" w:eastAsia="Times New Roman" w:hAnsi="Times New Roman" w:cs="Times New Roman"/>
+                      <w:noProof w:val="0"/>
+                      <w:sz w:val="24"/>
+                      <w:szCs w:val="24"/>
+                      <w:lang w:val="es-CO" w:eastAsia="es-CO"/>
+                    </w:rPr>
+                  </w:pPr>
+                </w:p>
+              </w:tc>
+              <w:tc>
+                <w:tcPr>
+                  <w:tcW w:w="0" w:type="auto"/>
+                  <w:vAlign w:val="center"/>
+                  <w:hideMark/>
+                </w:tcPr>
+                <w:p>
+                  <w:pPr>
+                    <w:spacing w:after="0" w:line="240" w:lineRule="auto"/>
+                    <w:rPr>
+                      <w:rFonts w:ascii="Times New Roman" w:eastAsia="Times New Roman" w:hAnsi="Times New Roman" w:cs="Times New Roman"/>
+                      <w:noProof w:val="0"/>
+                      <w:sz w:val="24"/>
+                      <w:szCs w:val="24"/>
+                      <w:lang w:eastAsia="es-CO"/>
+                    </w:rPr>
+                  </w:pPr>
+                  <w:r>
+                    <w:rPr>
+                      <w:rFonts w:ascii="Times New Roman" w:eastAsia="Times New Roman" w:hAnsi="Times New Roman" w:cs="Times New Roman"/>
+                      <w:noProof w:val="0"/>
+                      <w:sz w:val="24"/>
+                      <w:szCs w:val="24"/>
+                      <w:lang w:eastAsia="es-CO"/>
+                    </w:rPr>
+                    <w:t xml:space="preserve">12th Gen Intel(R) </w:t>
+                  </w:r>
+                  <w:proofErr w:type="gramStart"/>
+                  <w:r>
+                    <w:rPr>
+                      <w:rFonts w:ascii="Times New Roman" w:eastAsia="Times New Roman" w:hAnsi="Times New Roman" w:cs="Times New Roman"/>
+                      <w:noProof w:val="0"/>
+                      <w:sz w:val="24"/>
+                      <w:szCs w:val="24"/>
+                      <w:lang w:eastAsia="es-CO"/>
+                    </w:rPr>
+                    <w:t>Core(</w:t>
+                  </w:r>
+                  <w:proofErr w:type="gramEnd"/>
+                  <w:r>
+                    <w:rPr>
+                      <w:rFonts w:ascii="Times New Roman" w:eastAsia="Times New Roman" w:hAnsi="Times New Roman" w:cs="Times New Roman"/>
+                      <w:noProof w:val="0"/>
+                      <w:sz w:val="24"/>
+                      <w:szCs w:val="24"/>
+                      <w:lang w:eastAsia="es-CO"/>
+                    </w:rPr>
+                    <w:t>TM) i5-1235U</w:t>
+                  </w:r>
+                </w:p>
+              </w:tc>
+            </w:tr>
+          </w:tbl>
           <w:p>
             <w:pPr>
               <w:jc w:val="both"/>
               <w:cnfStyle w:val="000000100000" w:firstRow="0" w:lastRow="0" w:firstColumn="0" w:lastColumn="0" w:oddVBand="0" w:evenVBand="0" w:oddHBand="1" w:evenHBand="0" w:firstRowFirstColumn="0" w:firstRowLastColumn="0" w:lastRowFirstColumn="0" w:lastRowLastColumn="0"/>
               <w:rPr>
                 <w:rFonts w:ascii="Dax-Regular" w:hAnsi="Dax-Regular"/>
-                <w:lang w:val="es-419"/>
               </w:rPr>
             </w:pPr>
           </w:p>
@@ -257,6 +362,76 @@
           <w:tcPr>
             <w:tcW w:w="3525" w:type="pct"/>
           </w:tcPr>
+          <w:tbl>
+            <w:tblPr>
+              <w:tblW w:w="0" w:type="auto"/>
+              <w:tblCellSpacing w:w="15" w:type="dxa"/>
+              <w:tblCellMar>
+                <w:top w:w="15" w:type="dxa"/>
+                <w:left w:w="15" w:type="dxa"/>
+                <w:bottom w:w="15" w:type="dxa"/>
+                <w:right w:w="15" w:type="dxa"/>
+              </w:tblCellMar>
+              <w:tblLook w:val="04A0" w:firstRow="1" w:lastRow="0" w:firstColumn="1" w:lastColumn="0" w:noHBand="0" w:noVBand="1"/>
+            </w:tblPr>
+            <w:tblGrid>
+              <w:gridCol w:w="81"/>
+              <w:gridCol w:w="375"/>
+            </w:tblGrid>
+            <w:tr>
+              <w:trPr>
+                <w:tblCellSpacing w:w="15" w:type="dxa"/>
+              </w:trPr>
+              <w:tc>
+                <w:tcPr>
+                  <w:tcW w:w="0" w:type="auto"/>
+                  <w:vAlign w:val="center"/>
+                  <w:hideMark/>
+                </w:tcPr>
+                <w:p>
+                  <w:pPr>
+                    <w:spacing w:after="0" w:line="240" w:lineRule="auto"/>
+                    <w:rPr>
+                      <w:rFonts w:ascii="Times New Roman" w:eastAsia="Times New Roman" w:hAnsi="Times New Roman" w:cs="Times New Roman"/>
+                      <w:noProof w:val="0"/>
+                      <w:sz w:val="24"/>
+                      <w:szCs w:val="24"/>
+                      <w:lang w:val="es-CO" w:eastAsia="es-CO"/>
+                    </w:rPr>
+                  </w:pPr>
+                </w:p>
+              </w:tc>
+              <w:tc>
+                <w:tcPr>
+                  <w:tcW w:w="0" w:type="auto"/>
+                  <w:vAlign w:val="center"/>
+                  <w:hideMark/>
+                </w:tcPr>
+                <w:p>
+                  <w:pPr>
+                    <w:spacing w:after="0" w:line="240" w:lineRule="auto"/>
+                    <w:rPr>
+                      <w:rFonts w:ascii="Times New Roman" w:eastAsia="Times New Roman" w:hAnsi="Times New Roman" w:cs="Times New Roman"/>
+                      <w:noProof w:val="0"/>
+                      <w:sz w:val="24"/>
+                      <w:szCs w:val="24"/>
+                      <w:lang w:val="es-CO" w:eastAsia="es-CO"/>
+                    </w:rPr>
+                  </w:pPr>
+                  <w:r>
+                    <w:rPr>
+                      <w:rFonts w:ascii="Times New Roman" w:eastAsia="Times New Roman" w:hAnsi="Times New Roman" w:cs="Times New Roman"/>
+                      <w:noProof w:val="0"/>
+                      <w:sz w:val="24"/>
+                      <w:szCs w:val="24"/>
+                      <w:lang w:val="es-CO" w:eastAsia="es-CO"/>
+                    </w:rPr>
+                    <w:t>8.0</w:t>
+                  </w:r>
+                </w:p>
+              </w:tc>
+            </w:tr>
+          </w:tbl>
           <w:p>
             <w:pPr>
               <w:jc w:val="both"/>
@@ -300,13 +475,82 @@
           <w:tcPr>
             <w:tcW w:w="3525" w:type="pct"/>
           </w:tcPr>
+          <w:tbl>
+            <w:tblPr>
+              <w:tblW w:w="0" w:type="auto"/>
+              <w:tblCellSpacing w:w="15" w:type="dxa"/>
+              <w:tblCellMar>
+                <w:top w:w="15" w:type="dxa"/>
+                <w:left w:w="15" w:type="dxa"/>
+                <w:bottom w:w="15" w:type="dxa"/>
+                <w:right w:w="15" w:type="dxa"/>
+              </w:tblCellMar>
+              <w:tblLook w:val="04A0" w:firstRow="1" w:lastRow="0" w:firstColumn="1" w:lastColumn="0" w:noHBand="0" w:noVBand="1"/>
+            </w:tblPr>
+            <w:tblGrid>
+              <w:gridCol w:w="81"/>
+              <w:gridCol w:w="4468"/>
+            </w:tblGrid>
+            <w:tr>
+              <w:trPr>
+                <w:tblCellSpacing w:w="15" w:type="dxa"/>
+              </w:trPr>
+              <w:tc>
+                <w:tcPr>
+                  <w:tcW w:w="0" w:type="auto"/>
+                  <w:vAlign w:val="center"/>
+                  <w:hideMark/>
+                </w:tcPr>
+                <w:p>
+                  <w:pPr>
+                    <w:spacing w:after="0" w:line="240" w:lineRule="auto"/>
+                    <w:rPr>
+                      <w:rFonts w:ascii="Times New Roman" w:eastAsia="Times New Roman" w:hAnsi="Times New Roman" w:cs="Times New Roman"/>
+                      <w:noProof w:val="0"/>
+                      <w:sz w:val="24"/>
+                      <w:szCs w:val="24"/>
+                      <w:lang w:val="es-CO" w:eastAsia="es-CO"/>
+                    </w:rPr>
+                  </w:pPr>
+                </w:p>
+              </w:tc>
+              <w:tc>
+                <w:tcPr>
+                  <w:tcW w:w="0" w:type="auto"/>
+                  <w:vAlign w:val="center"/>
+                  <w:hideMark/>
+                </w:tcPr>
+                <w:p>
+                  <w:pPr>
+                    <w:spacing w:after="0" w:line="240" w:lineRule="auto"/>
+                    <w:rPr>
+                      <w:rFonts w:ascii="Times New Roman" w:eastAsia="Times New Roman" w:hAnsi="Times New Roman" w:cs="Times New Roman"/>
+                      <w:noProof w:val="0"/>
+                      <w:sz w:val="24"/>
+                      <w:szCs w:val="24"/>
+                      <w:lang w:eastAsia="es-CO"/>
+                    </w:rPr>
+                  </w:pPr>
+                  <w:r>
+                    <w:rPr>
+                      <w:rFonts w:ascii="Times New Roman" w:eastAsia="Times New Roman" w:hAnsi="Times New Roman" w:cs="Times New Roman"/>
+                      <w:noProof w:val="0"/>
+                      <w:sz w:val="24"/>
+                      <w:szCs w:val="24"/>
+                      <w:lang w:eastAsia="es-CO"/>
+                    </w:rPr>
+                    <w:t>Windows 11 Home Single Language - 64 bits</w:t>
+                  </w:r>
+                </w:p>
+              </w:tc>
+            </w:tr>
+          </w:tbl>
           <w:p>
             <w:pPr>
               <w:jc w:val="both"/>
               <w:cnfStyle w:val="000000100000" w:firstRow="0" w:lastRow="0" w:firstColumn="0" w:lastColumn="0" w:oddVBand="0" w:evenVBand="0" w:oddHBand="1" w:evenHBand="0" w:firstRowFirstColumn="0" w:firstRowLastColumn="0" w:lastRowFirstColumn="0" w:lastRowLastColumn="0"/>
               <w:rPr>
                 <w:rFonts w:ascii="Dax-Regular" w:hAnsi="Dax-Regular"/>
-                <w:lang w:val="es-419"/>
               </w:rPr>
             </w:pPr>
           </w:p>
@@ -652,6 +896,14 @@
                 <w:lang w:val="es-419"/>
               </w:rPr>
             </w:pPr>
+            <w:r>
+              <w:rPr>
+                <w:rFonts w:ascii="Calibri" w:eastAsia="Times New Roman" w:hAnsi="Calibri" w:cs="Calibri"/>
+                <w:color w:val="000000"/>
+                <w:lang w:val="es-419"/>
+              </w:rPr>
+              <w:t>724193.76</w:t>
+            </w:r>
           </w:p>
         </w:tc>
         <w:tc>
@@ -677,6 +929,14 @@
                 <w:lang w:val="es-419"/>
               </w:rPr>
             </w:pPr>
+            <w:r>
+              <w:rPr>
+                <w:rFonts w:ascii="Calibri" w:eastAsia="Times New Roman" w:hAnsi="Calibri" w:cs="Calibri"/>
+                <w:color w:val="000000"/>
+                <w:lang w:val="es-419"/>
+              </w:rPr>
+              <w:t>8563.34</w:t>
+            </w:r>
           </w:p>
         </w:tc>
       </w:tr>
@@ -737,6 +997,14 @@
                 <w:lang w:val="es-419"/>
               </w:rPr>
             </w:pPr>
+            <w:r>
+              <w:rPr>
+                <w:rFonts w:ascii="Calibri" w:eastAsia="Times New Roman" w:hAnsi="Calibri" w:cs="Calibri"/>
+                <w:color w:val="000000"/>
+                <w:lang w:val="es-419"/>
+              </w:rPr>
+              <w:t>425875.13</w:t>
+            </w:r>
           </w:p>
         </w:tc>
         <w:tc>
@@ -761,6 +1029,14 @@
                 <w:lang w:val="es-419"/>
               </w:rPr>
             </w:pPr>
+            <w:r>
+              <w:rPr>
+                <w:rFonts w:ascii="Calibri" w:eastAsia="Times New Roman" w:hAnsi="Calibri" w:cs="Calibri"/>
+                <w:color w:val="000000"/>
+                <w:lang w:val="es-419"/>
+              </w:rPr>
+              <w:t>7417.55</w:t>
+            </w:r>
           </w:p>
         </w:tc>
       </w:tr>
@@ -821,6 +1097,14 @@
                 <w:lang w:val="es-419"/>
               </w:rPr>
             </w:pPr>
+            <w:r>
+              <w:rPr>
+                <w:rFonts w:ascii="Calibri" w:eastAsia="Times New Roman" w:hAnsi="Calibri" w:cs="Calibri"/>
+                <w:color w:val="000000"/>
+                <w:lang w:val="es-419"/>
+              </w:rPr>
+              <w:t>404349.61</w:t>
+            </w:r>
           </w:p>
         </w:tc>
         <w:tc>
@@ -845,6 +1129,14 @@
                 <w:lang w:val="es-419"/>
               </w:rPr>
             </w:pPr>
+            <w:r>
+              <w:rPr>
+                <w:rFonts w:ascii="Calibri" w:eastAsia="Times New Roman" w:hAnsi="Calibri" w:cs="Calibri"/>
+                <w:color w:val="000000"/>
+                <w:lang w:val="es-419"/>
+              </w:rPr>
+              <w:t>6574.28</w:t>
+            </w:r>
           </w:p>
         </w:tc>
       </w:tr>
@@ -905,6 +1197,14 @@
                 <w:lang w:val="es-419"/>
               </w:rPr>
             </w:pPr>
+            <w:r>
+              <w:rPr>
+                <w:rFonts w:ascii="Calibri" w:eastAsia="Times New Roman" w:hAnsi="Calibri" w:cs="Calibri"/>
+                <w:color w:val="000000"/>
+                <w:lang w:val="es-419"/>
+              </w:rPr>
+              <w:t>393285.16</w:t>
+            </w:r>
           </w:p>
         </w:tc>
         <w:tc>
@@ -929,6 +1229,14 @@
                 <w:lang w:val="es-419"/>
               </w:rPr>
             </w:pPr>
+            <w:r>
+              <w:rPr>
+                <w:rFonts w:ascii="Calibri" w:eastAsia="Times New Roman" w:hAnsi="Calibri" w:cs="Calibri"/>
+                <w:color w:val="000000"/>
+                <w:lang w:val="es-419"/>
+              </w:rPr>
+              <w:t>7100.05</w:t>
+            </w:r>
           </w:p>
         </w:tc>
       </w:tr>
@@ -1277,6 +1585,14 @@
                 <w:lang w:val="es-419"/>
               </w:rPr>
             </w:pPr>
+            <w:r>
+              <w:rPr>
+                <w:rFonts w:ascii="Calibri" w:eastAsia="Times New Roman" w:hAnsi="Calibri" w:cs="Calibri"/>
+                <w:color w:val="000000"/>
+                <w:lang w:val="es-419"/>
+              </w:rPr>
+              <w:t>409415.80</w:t>
+            </w:r>
           </w:p>
         </w:tc>
         <w:tc>
@@ -1301,6 +1617,14 @@
                 <w:lang w:val="es-419"/>
               </w:rPr>
             </w:pPr>
+            <w:r>
+              <w:rPr>
+                <w:rFonts w:ascii="Calibri" w:eastAsia="Times New Roman" w:hAnsi="Calibri" w:cs="Calibri"/>
+                <w:color w:val="000000"/>
+                <w:lang w:val="es-419"/>
+              </w:rPr>
+              <w:t>5106.29</w:t>
+            </w:r>
           </w:p>
         </w:tc>
       </w:tr>
@@ -1361,6 +1685,14 @@
                 <w:lang w:val="es-419"/>
               </w:rPr>
             </w:pPr>
+            <w:r>
+              <w:rPr>
+                <w:rFonts w:ascii="Calibri" w:eastAsia="Times New Roman" w:hAnsi="Calibri" w:cs="Calibri"/>
+                <w:color w:val="000000"/>
+                <w:lang w:val="es-419"/>
+              </w:rPr>
+              <w:t>401309.96</w:t>
+            </w:r>
           </w:p>
         </w:tc>
         <w:tc>
@@ -1384,6 +1716,14 @@
                 <w:lang w:val="es-419"/>
               </w:rPr>
             </w:pPr>
+            <w:r>
+              <w:rPr>
+                <w:rFonts w:ascii="Calibri" w:eastAsia="Times New Roman" w:hAnsi="Calibri" w:cs="Calibri"/>
+                <w:color w:val="000000"/>
+                <w:lang w:val="es-419"/>
+              </w:rPr>
+              <w:t>6025.89</w:t>
+            </w:r>
           </w:p>
         </w:tc>
       </w:tr>
@@ -1446,6 +1786,14 @@
                 <w:lang w:val="es-419"/>
               </w:rPr>
             </w:pPr>
+            <w:r>
+              <w:rPr>
+                <w:rFonts w:ascii="Calibri" w:eastAsia="Times New Roman" w:hAnsi="Calibri" w:cs="Calibri"/>
+                <w:color w:val="000000"/>
+                <w:lang w:val="es-419"/>
+              </w:rPr>
+              <w:t>398060.24</w:t>
+            </w:r>
           </w:p>
         </w:tc>
         <w:tc>
@@ -1471,6 +1819,14 @@
                 <w:lang w:val="es-419"/>
               </w:rPr>
             </w:pPr>
+            <w:r>
+              <w:rPr>
+                <w:rFonts w:ascii="Calibri" w:eastAsia="Times New Roman" w:hAnsi="Calibri" w:cs="Calibri"/>
+                <w:color w:val="000000"/>
+                <w:lang w:val="es-419"/>
+              </w:rPr>
+              <w:t>8109.26</w:t>
+            </w:r>
           </w:p>
         </w:tc>
       </w:tr>
@@ -1531,6 +1887,14 @@
                 <w:lang w:val="es-419"/>
               </w:rPr>
             </w:pPr>
+            <w:r>
+              <w:rPr>
+                <w:rFonts w:ascii="Calibri" w:eastAsia="Times New Roman" w:hAnsi="Calibri" w:cs="Calibri"/>
+                <w:color w:val="000000"/>
+                <w:lang w:val="es-419"/>
+              </w:rPr>
+              <w:t>395228.30</w:t>
+            </w:r>
           </w:p>
         </w:tc>
         <w:tc>
@@ -1554,6 +1918,14 @@
                 <w:lang w:val="es-419"/>
               </w:rPr>
             </w:pPr>
+            <w:r>
+              <w:rPr>
+                <w:rFonts w:ascii="Calibri" w:eastAsia="Times New Roman" w:hAnsi="Calibri" w:cs="Calibri"/>
+                <w:color w:val="000000"/>
+                <w:lang w:val="es-419"/>
+              </w:rPr>
+              <w:t>6330.62</w:t>
+            </w:r>
           </w:p>
         </w:tc>
       </w:tr>
@@ -1787,6 +2159,69 @@
     <w:p>
       <w:pPr>
         <w:pStyle w:val="Prrafodelista"/>
+        <w:spacing w:after="0"/>
+        <w:jc w:val="both"/>
+        <w:rPr>
+          <w:rFonts w:ascii="Dax-Regular" w:hAnsi="Dax-Regular"/>
+          <w:lang w:val="es-CO"/>
+        </w:rPr>
+      </w:pPr>
+    </w:p>
+    <w:p>
+      <w:pPr>
+        <w:pStyle w:val="Prrafodelista"/>
+        <w:spacing w:after="0"/>
+        <w:jc w:val="both"/>
+        <w:rPr>
+          <w:rFonts w:ascii="Dax-Regular" w:hAnsi="Dax-Regular"/>
+          <w:lang w:val="es-CO"/>
+        </w:rPr>
+      </w:pPr>
+      <w:r>
+        <w:rPr>
+          <w:rFonts w:ascii="Dax-Regular" w:hAnsi="Dax-Regular"/>
+          <w:lang w:val="es-CO"/>
+        </w:rPr>
+        <w:drawing>
+          <wp:inline distT="0" distB="0" distL="0" distR="0" wp14:anchorId="2097BB3B" wp14:editId="40785D36">
+            <wp:extent cx="2743200" cy="1325587"/>
+            <wp:effectExtent l="0" t="0" r="0" b="8255"/>
+            <wp:docPr id="1999193231" name="Imagen 1"/>
+            <wp:cNvGraphicFramePr>
+              <a:graphicFrameLocks xmlns:a="http://schemas.openxmlformats.org/drawingml/2006/main" noChangeAspect="1"/>
+            </wp:cNvGraphicFramePr>
+            <a:graphic xmlns:a="http://schemas.openxmlformats.org/drawingml/2006/main">
+              <a:graphicData uri="http://schemas.openxmlformats.org/drawingml/2006/picture">
+                <pic:pic xmlns:pic="http://schemas.openxmlformats.org/drawingml/2006/picture">
+                  <pic:nvPicPr>
+                    <pic:cNvPr id="1999193231" name=""/>
+                    <pic:cNvPicPr/>
+                  </pic:nvPicPr>
+                  <pic:blipFill>
+                    <a:blip r:embed="rId10"/>
+                    <a:stretch>
+                      <a:fillRect/>
+                    </a:stretch>
+                  </pic:blipFill>
+                  <pic:spPr>
+                    <a:xfrm>
+                      <a:off x="0" y="0"/>
+                      <a:ext cx="2747259" cy="1327549"/>
+                    </a:xfrm>
+                    <a:prstGeom prst="rect">
+                      <a:avLst/>
+                    </a:prstGeom>
+                  </pic:spPr>
+                </pic:pic>
+              </a:graphicData>
+            </a:graphic>
+          </wp:inline>
+        </w:drawing>
+      </w:r>
+    </w:p>
+    <w:p>
+      <w:pPr>
+        <w:pStyle w:val="Prrafodelista"/>
         <w:numPr>
           <w:ilvl w:val="0"/>
           <w:numId w:val="10"/>
@@ -1803,6 +2238,7 @@
           <w:rFonts w:ascii="Dax-Regular" w:hAnsi="Dax-Regular"/>
           <w:lang w:val="es-CO"/>
         </w:rPr>
+        <w:lastRenderedPageBreak/>
         <w:t xml:space="preserve">Comparación de </w:t>
       </w:r>
       <w:r>
@@ -1858,6 +2294,47 @@
           <w:lang w:val="es-CO"/>
         </w:rPr>
       </w:pPr>
+      <w:r>
+        <w:rPr>
+          <w:rFonts w:ascii="Dax-Regular" w:hAnsi="Dax-Regular"/>
+          <w:lang w:val="es-CO"/>
+        </w:rPr>
+        <w:drawing>
+          <wp:inline distT="0" distB="0" distL="0" distR="0" wp14:anchorId="01CE71E9" wp14:editId="10BF3848">
+            <wp:extent cx="3302000" cy="1827033"/>
+            <wp:effectExtent l="0" t="0" r="0" b="1905"/>
+            <wp:docPr id="1514521735" name="Imagen 1"/>
+            <wp:cNvGraphicFramePr>
+              <a:graphicFrameLocks xmlns:a="http://schemas.openxmlformats.org/drawingml/2006/main" noChangeAspect="1"/>
+            </wp:cNvGraphicFramePr>
+            <a:graphic xmlns:a="http://schemas.openxmlformats.org/drawingml/2006/main">
+              <a:graphicData uri="http://schemas.openxmlformats.org/drawingml/2006/picture">
+                <pic:pic xmlns:pic="http://schemas.openxmlformats.org/drawingml/2006/picture">
+                  <pic:nvPicPr>
+                    <pic:cNvPr id="1514521735" name=""/>
+                    <pic:cNvPicPr/>
+                  </pic:nvPicPr>
+                  <pic:blipFill>
+                    <a:blip r:embed="rId11"/>
+                    <a:stretch>
+                      <a:fillRect/>
+                    </a:stretch>
+                  </pic:blipFill>
+                  <pic:spPr>
+                    <a:xfrm>
+                      <a:off x="0" y="0"/>
+                      <a:ext cx="3305971" cy="1829230"/>
+                    </a:xfrm>
+                    <a:prstGeom prst="rect">
+                      <a:avLst/>
+                    </a:prstGeom>
+                  </pic:spPr>
+                </pic:pic>
+              </a:graphicData>
+            </a:graphic>
+          </wp:inline>
+        </w:drawing>
+      </w:r>
     </w:p>
     <w:p>
       <w:pPr>
@@ -1866,31 +2343,6 @@
           <w:lang w:val="es-CO"/>
         </w:rPr>
       </w:pPr>
-    </w:p>
-    <w:p>
-      <w:pPr>
-        <w:spacing w:after="0"/>
-        <w:jc w:val="both"/>
-        <w:rPr>
-          <w:rFonts w:ascii="Dax-Regular" w:hAnsi="Dax-Regular"/>
-          <w:lang w:val="es-CO"/>
-        </w:rPr>
-      </w:pPr>
-    </w:p>
-    <w:p>
-      <w:pPr>
-        <w:rPr>
-          <w:rFonts w:ascii="Dax-Regular" w:hAnsi="Dax-Regular"/>
-          <w:lang w:val="es-CO"/>
-        </w:rPr>
-      </w:pPr>
-      <w:r>
-        <w:rPr>
-          <w:rFonts w:ascii="Dax-Regular" w:hAnsi="Dax-Regular"/>
-          <w:lang w:val="es-CO"/>
-        </w:rPr>
-        <w:br w:type="page"/>
-      </w:r>
     </w:p>
     <w:p>
       <w:pPr>
@@ -1909,7 +2361,6 @@
           <w:noProof w:val="0"/>
           <w:lang w:val="es-CO"/>
         </w:rPr>
-        <w:lastRenderedPageBreak/>
         <w:t>Preguntas de análisis</w:t>
       </w:r>
     </w:p>
@@ -1939,41 +2390,137 @@
         </w:rPr>
         <w:t xml:space="preserve">¿Por qué en la función </w:t>
       </w:r>
+      <w:proofErr w:type="spellStart"/>
+      <w:proofErr w:type="gramStart"/>
       <w:r>
         <w:rPr>
           <w:b/>
           <w:bCs/>
           <w:lang w:val="es-419"/>
         </w:rPr>
-        <w:t>getTime()</w:t>
-      </w:r>
-      <w:r>
-        <w:rPr>
-          <w:lang w:val="es-419"/>
-        </w:rPr>
-        <w:t xml:space="preserve"> se utiliza </w:t>
-      </w:r>
+        <w:t>getTime</w:t>
+      </w:r>
+      <w:proofErr w:type="spellEnd"/>
       <w:r>
         <w:rPr>
           <w:b/>
           <w:bCs/>
           <w:lang w:val="es-419"/>
         </w:rPr>
-        <w:t>time.perf_counter()</w:t>
-      </w:r>
-      <w:r>
-        <w:rPr>
-          <w:lang w:val="es-419"/>
-        </w:rPr>
-        <w:t xml:space="preserve"> en vez de otras funciones como </w:t>
-      </w:r>
+        <w:t>(</w:t>
+      </w:r>
+      <w:proofErr w:type="gramEnd"/>
       <w:r>
         <w:rPr>
           <w:b/>
           <w:bCs/>
           <w:lang w:val="es-419"/>
         </w:rPr>
-        <w:t>time.process_time()</w:t>
+        <w:t>)</w:t>
+      </w:r>
+      <w:r>
+        <w:rPr>
+          <w:lang w:val="es-419"/>
+        </w:rPr>
+        <w:t xml:space="preserve"> se utiliza </w:t>
+      </w:r>
+      <w:proofErr w:type="spellStart"/>
+      <w:proofErr w:type="gramStart"/>
+      <w:r>
+        <w:rPr>
+          <w:b/>
+          <w:bCs/>
+          <w:lang w:val="es-419"/>
+        </w:rPr>
+        <w:t>time.perf</w:t>
+      </w:r>
+      <w:proofErr w:type="gramEnd"/>
+      <w:r>
+        <w:rPr>
+          <w:b/>
+          <w:bCs/>
+          <w:lang w:val="es-419"/>
+        </w:rPr>
+        <w:t>_</w:t>
+      </w:r>
+      <w:proofErr w:type="gramStart"/>
+      <w:r>
+        <w:rPr>
+          <w:b/>
+          <w:bCs/>
+          <w:lang w:val="es-419"/>
+        </w:rPr>
+        <w:t>counter</w:t>
+      </w:r>
+      <w:proofErr w:type="spellEnd"/>
+      <w:r>
+        <w:rPr>
+          <w:b/>
+          <w:bCs/>
+          <w:lang w:val="es-419"/>
+        </w:rPr>
+        <w:t>(</w:t>
+      </w:r>
+      <w:proofErr w:type="gramEnd"/>
+      <w:r>
+        <w:rPr>
+          <w:b/>
+          <w:bCs/>
+          <w:lang w:val="es-419"/>
+        </w:rPr>
+        <w:t>)</w:t>
+      </w:r>
+      <w:r>
+        <w:rPr>
+          <w:lang w:val="es-419"/>
+        </w:rPr>
+        <w:t xml:space="preserve"> en vez de otras funciones como </w:t>
+      </w:r>
+      <w:proofErr w:type="spellStart"/>
+      <w:proofErr w:type="gramStart"/>
+      <w:r>
+        <w:rPr>
+          <w:b/>
+          <w:bCs/>
+          <w:lang w:val="es-419"/>
+        </w:rPr>
+        <w:t>time.process</w:t>
+      </w:r>
+      <w:proofErr w:type="gramEnd"/>
+      <w:r>
+        <w:rPr>
+          <w:b/>
+          <w:bCs/>
+          <w:lang w:val="es-419"/>
+        </w:rPr>
+        <w:t>_</w:t>
+      </w:r>
+      <w:proofErr w:type="gramStart"/>
+      <w:r>
+        <w:rPr>
+          <w:b/>
+          <w:bCs/>
+          <w:lang w:val="es-419"/>
+        </w:rPr>
+        <w:t>time</w:t>
+      </w:r>
+      <w:proofErr w:type="spellEnd"/>
+      <w:r>
+        <w:rPr>
+          <w:b/>
+          <w:bCs/>
+          <w:lang w:val="es-419"/>
+        </w:rPr>
+        <w:t>(</w:t>
+      </w:r>
+      <w:proofErr w:type="gramEnd"/>
+      <w:r>
+        <w:rPr>
+          <w:b/>
+          <w:bCs/>
+          <w:lang w:val="es-419"/>
+        </w:rPr>
+        <w:t>)</w:t>
       </w:r>
       <w:r>
         <w:rPr>
@@ -1981,12 +2528,92 @@
         </w:rPr>
         <w:t>?</w:t>
       </w:r>
-      <w:r>
-        <w:rPr>
-          <w:lang w:val="es-419"/>
-        </w:rPr>
-        <w:br/>
-      </w:r>
+    </w:p>
+    <w:p>
+      <w:pPr>
+        <w:pStyle w:val="Prrafodelista"/>
+        <w:ind w:left="360"/>
+        <w:jc w:val="both"/>
+        <w:rPr>
+          <w:lang w:val="es-419"/>
+        </w:rPr>
+      </w:pPr>
+    </w:p>
+    <w:p>
+      <w:pPr>
+        <w:pStyle w:val="Prrafodelista"/>
+        <w:ind w:left="360"/>
+        <w:jc w:val="both"/>
+        <w:rPr>
+          <w:lang w:val="es-419"/>
+        </w:rPr>
+      </w:pPr>
+      <w:proofErr w:type="spellStart"/>
+      <w:r>
+        <w:rPr>
+          <w:lang w:val="es-419"/>
+        </w:rPr>
+        <w:t>Perf_</w:t>
+      </w:r>
+      <w:proofErr w:type="gramStart"/>
+      <w:r>
+        <w:rPr>
+          <w:lang w:val="es-419"/>
+        </w:rPr>
+        <w:t>counter</w:t>
+      </w:r>
+      <w:proofErr w:type="spellEnd"/>
+      <w:r>
+        <w:rPr>
+          <w:lang w:val="es-419"/>
+        </w:rPr>
+        <w:t>(</w:t>
+      </w:r>
+      <w:proofErr w:type="gramEnd"/>
+      <w:r>
+        <w:rPr>
+          <w:lang w:val="es-419"/>
+        </w:rPr>
+        <w:t xml:space="preserve">) mide el tiempo real transcurrido, con alta precisión e incluyendo la lectura de archivos. </w:t>
+      </w:r>
+      <w:proofErr w:type="spellStart"/>
+      <w:r>
+        <w:rPr>
+          <w:lang w:val="es-419"/>
+        </w:rPr>
+        <w:t>Process_</w:t>
+      </w:r>
+      <w:proofErr w:type="gramStart"/>
+      <w:r>
+        <w:rPr>
+          <w:lang w:val="es-419"/>
+        </w:rPr>
+        <w:t>time</w:t>
+      </w:r>
+      <w:proofErr w:type="spellEnd"/>
+      <w:r>
+        <w:rPr>
+          <w:lang w:val="es-419"/>
+        </w:rPr>
+        <w:t>(</w:t>
+      </w:r>
+      <w:proofErr w:type="gramEnd"/>
+      <w:r>
+        <w:rPr>
+          <w:lang w:val="es-419"/>
+        </w:rPr>
+        <w:t>) solo cuenta el tiempo de CPU y deja por fuera las esperas, así que no refleja lo que realmente carga.</w:t>
+      </w:r>
+    </w:p>
+    <w:p>
+      <w:pPr>
+        <w:pStyle w:val="Prrafodelista"/>
+        <w:ind w:left="360"/>
+        <w:jc w:val="both"/>
+        <w:rPr>
+          <w:lang w:val="es-419"/>
+        </w:rPr>
+      </w:pPr>
     </w:p>
     <w:p>
       <w:pPr>
@@ -2006,42 +2633,74 @@
         </w:rPr>
         <w:t xml:space="preserve">¿Por qué son importantes las funciones </w:t>
       </w:r>
+      <w:proofErr w:type="spellStart"/>
+      <w:proofErr w:type="gramStart"/>
       <w:r>
         <w:rPr>
           <w:b/>
           <w:bCs/>
           <w:lang w:val="es-419"/>
         </w:rPr>
-        <w:t>start()</w:t>
-      </w:r>
-      <w:r>
-        <w:rPr>
-          <w:lang w:val="es-419"/>
-        </w:rPr>
-        <w:t xml:space="preserve"> y </w:t>
-      </w:r>
+        <w:t>start</w:t>
+      </w:r>
+      <w:proofErr w:type="spellEnd"/>
       <w:r>
         <w:rPr>
           <w:b/>
           <w:bCs/>
           <w:lang w:val="es-419"/>
         </w:rPr>
-        <w:t>stop()</w:t>
-      </w:r>
-      <w:r>
-        <w:rPr>
-          <w:lang w:val="es-419"/>
-        </w:rPr>
-        <w:t xml:space="preserve"> de la librería </w:t>
-      </w:r>
+        <w:t>(</w:t>
+      </w:r>
+      <w:proofErr w:type="gramEnd"/>
       <w:r>
         <w:rPr>
           <w:b/>
           <w:bCs/>
           <w:lang w:val="es-419"/>
         </w:rPr>
+        <w:t>)</w:t>
+      </w:r>
+      <w:r>
+        <w:rPr>
+          <w:lang w:val="es-419"/>
+        </w:rPr>
+        <w:t xml:space="preserve"> y </w:t>
+      </w:r>
+      <w:proofErr w:type="gramStart"/>
+      <w:r>
+        <w:rPr>
+          <w:b/>
+          <w:bCs/>
+          <w:lang w:val="es-419"/>
+        </w:rPr>
+        <w:t>stop(</w:t>
+      </w:r>
+      <w:proofErr w:type="gramEnd"/>
+      <w:r>
+        <w:rPr>
+          <w:b/>
+          <w:bCs/>
+          <w:lang w:val="es-419"/>
+        </w:rPr>
+        <w:t>)</w:t>
+      </w:r>
+      <w:r>
+        <w:rPr>
+          <w:lang w:val="es-419"/>
+        </w:rPr>
+        <w:t xml:space="preserve"> de la librería </w:t>
+      </w:r>
+      <w:proofErr w:type="spellStart"/>
+      <w:r>
+        <w:rPr>
+          <w:b/>
+          <w:bCs/>
+          <w:lang w:val="es-419"/>
+        </w:rPr>
         <w:t>tracemalloc</w:t>
       </w:r>
+      <w:proofErr w:type="spellEnd"/>
       <w:r>
         <w:rPr>
           <w:lang w:val="es-419"/>
@@ -2051,13 +2710,18 @@
     </w:p>
     <w:p>
       <w:pPr>
-        <w:pStyle w:val="Prrafodelista"/>
         <w:ind w:left="360"/>
         <w:jc w:val="both"/>
         <w:rPr>
           <w:lang w:val="es-419"/>
         </w:rPr>
       </w:pPr>
+      <w:r>
+        <w:rPr>
+          <w:lang w:val="es-419"/>
+        </w:rPr>
+        <w:t>Start() activa el registro de la memoria que usa Python, sin el no se puede medir nada, stop() lo apaga y libera su memoria, para que el rastreo no siga haciendose mas lento el resto del programa.</w:t>
+      </w:r>
     </w:p>
     <w:p>
       <w:pPr>
@@ -2119,25 +2783,52 @@
     <w:p>
       <w:pPr>
         <w:pStyle w:val="Prrafodelista"/>
-        <w:numPr>
-          <w:ilvl w:val="0"/>
-          <w:numId w:val="13"/>
-        </w:numPr>
+        <w:ind w:left="360"/>
         <w:jc w:val="both"/>
         <w:rPr>
-          <w:lang w:val="es-419"/>
-        </w:rPr>
-      </w:pPr>
-      <w:r>
-        <w:rPr>
-          <w:lang w:val="es-419"/>
-        </w:rPr>
-        <w:t>Dado el número de elementos de los archivos (large), ¿Cuál sería el factor de carga para estos índices según su mecanismo de colisión?</w:t>
+          <w:lang w:val="es-CO"/>
+        </w:rPr>
+      </w:pPr>
+      <w:r>
+        <w:rPr>
+          <w:lang w:val="es-CO"/>
+        </w:rPr>
+        <w:t xml:space="preserve">Porque </w:t>
+      </w:r>
+      <w:proofErr w:type="spellStart"/>
+      <w:r>
+        <w:rPr>
+          <w:lang w:val="es-CO"/>
+        </w:rPr>
+        <w:t>tracemalloc</w:t>
+      </w:r>
+      <w:proofErr w:type="spellEnd"/>
+      <w:r>
+        <w:rPr>
+          <w:lang w:val="es-CO"/>
+        </w:rPr>
+        <w:t xml:space="preserve"> hace más lenta la ejecución mientras registra la memoria. En las pruebas, la carga tardó unos 30.000 ms con </w:t>
+      </w:r>
+      <w:proofErr w:type="spellStart"/>
+      <w:r>
+        <w:rPr>
+          <w:lang w:val="es-CO"/>
+        </w:rPr>
+        <w:t>tracemalloc</w:t>
+      </w:r>
+      <w:proofErr w:type="spellEnd"/>
+      <w:r>
+        <w:rPr>
+          <w:lang w:val="es-CO"/>
+        </w:rPr>
+        <w:t xml:space="preserve"> y unos 6.500 ms sin él, así que el tiempo real se mide en una corrida aparte.</w:t>
       </w:r>
     </w:p>
     <w:p>
       <w:pPr>
         <w:pStyle w:val="Prrafodelista"/>
+        <w:ind w:left="360"/>
+        <w:jc w:val="both"/>
         <w:rPr>
           <w:lang w:val="es-419"/>
         </w:rPr>
@@ -2159,7 +2850,103 @@
         <w:rPr>
           <w:lang w:val="es-419"/>
         </w:rPr>
-        <w:t>¿Qué cambios percibe en el tiempo de ejecución al modificar el factor de carga máximo?</w:t>
+        <w:t>Dado el número de elementos de los archivos (</w:t>
+      </w:r>
+      <w:proofErr w:type="spellStart"/>
+      <w:r>
+        <w:rPr>
+          <w:lang w:val="es-419"/>
+        </w:rPr>
+        <w:t>large</w:t>
+      </w:r>
+      <w:proofErr w:type="spellEnd"/>
+      <w:r>
+        <w:rPr>
+          <w:lang w:val="es-419"/>
+        </w:rPr>
+        <w:t>), ¿Cuál sería el factor de carga para estos índices según su mecanismo de colisión?</w:t>
+      </w:r>
+    </w:p>
+    <w:p>
+      <w:pPr>
+        <w:pStyle w:val="Prrafodelista"/>
+        <w:ind w:left="360"/>
+        <w:jc w:val="both"/>
+        <w:rPr>
+          <w:lang w:val="es-419"/>
+        </w:rPr>
+      </w:pPr>
+    </w:p>
+    <w:p>
+      <w:pPr>
+        <w:pStyle w:val="Prrafodelista"/>
+        <w:ind w:left="360"/>
+        <w:jc w:val="both"/>
+        <w:rPr>
+          <w:lang w:val="es-CO"/>
+        </w:rPr>
+      </w:pPr>
+      <w:r>
+        <w:rPr>
+          <w:lang w:val="es-CO"/>
+        </w:rPr>
+        <w:t xml:space="preserve">Con 10.000 libros, 5.841 autores y 34.252 tags, los índices quedaron con factores entre 0,08 y 0,70 en </w:t>
+      </w:r>
+      <w:proofErr w:type="spellStart"/>
+      <w:r>
+        <w:rPr>
+          <w:lang w:val="es-CO"/>
+        </w:rPr>
+        <w:t>probing</w:t>
+      </w:r>
+      <w:proofErr w:type="spellEnd"/>
+      <w:r>
+        <w:rPr>
+          <w:lang w:val="es-CO"/>
+        </w:rPr>
+        <w:t xml:space="preserve"> (límite 0,7) y entre 0,47 y 4,0 en </w:t>
+      </w:r>
+      <w:proofErr w:type="spellStart"/>
+      <w:r>
+        <w:rPr>
+          <w:lang w:val="es-CO"/>
+        </w:rPr>
+        <w:t>chaining</w:t>
+      </w:r>
+      <w:proofErr w:type="spellEnd"/>
+      <w:r>
+        <w:rPr>
+          <w:lang w:val="es-CO"/>
+        </w:rPr>
+        <w:t xml:space="preserve"> (límite 4). En </w:t>
+      </w:r>
+      <w:proofErr w:type="spellStart"/>
+      <w:r>
+        <w:rPr>
+          <w:lang w:val="es-CO"/>
+        </w:rPr>
+        <w:t>probing</w:t>
+      </w:r>
+      <w:proofErr w:type="spellEnd"/>
+      <w:r>
+        <w:rPr>
+          <w:lang w:val="es-CO"/>
+        </w:rPr>
+        <w:t xml:space="preserve"> conviene un factor menor que 1, alrededor de 0,5 a 0,7. En </w:t>
+      </w:r>
+      <w:proofErr w:type="spellStart"/>
+      <w:r>
+        <w:rPr>
+          <w:lang w:val="es-CO"/>
+        </w:rPr>
+        <w:t>chaining</w:t>
+      </w:r>
+      <w:proofErr w:type="spellEnd"/>
+      <w:r>
+        <w:rPr>
+          <w:lang w:val="es-CO"/>
+        </w:rPr>
+        <w:t xml:space="preserve"> puede ser mayor que 1, y los mejores tiempos se dieron con 2 a 4.</w:t>
       </w:r>
     </w:p>
     <w:p>
@@ -2186,16 +2973,30 @@
         <w:rPr>
           <w:lang w:val="es-419"/>
         </w:rPr>
-        <w:t>¿Qué cambios percibe en el consumo de memoria al modificar el factor de carga máximo?</w:t>
+        <w:t>¿Qué cambios percibe en el tiempo de ejecución al modificar el factor de carga máximo?</w:t>
       </w:r>
     </w:p>
     <w:p>
       <w:pPr>
-        <w:pStyle w:val="Prrafodelista"/>
-        <w:rPr>
-          <w:lang w:val="es-419"/>
-        </w:rPr>
-      </w:pPr>
+        <w:rPr>
+          <w:lang w:val="es-419"/>
+        </w:rPr>
+      </w:pPr>
+    </w:p>
+    <w:p>
+      <w:pPr>
+        <w:ind w:left="360"/>
+        <w:rPr>
+          <w:lang w:val="es-CO"/>
+        </w:rPr>
+      </w:pPr>
+      <w:r>
+        <w:rPr>
+          <w:lang w:val="es-CO"/>
+        </w:rPr>
+        <w:lastRenderedPageBreak/>
+        <w:t>En probing, el más lento fue 0,1 (8.563 ms), el mejor 0,7 (6.574 ms), y con 0,9 volvió a subir por las colisiones. En chaining, el tiempo tiende a subir con el factor (de 5.106 ms con 2 a 8.109 ms con 6), porque las listas se alargan.</w:t>
+      </w:r>
     </w:p>
     <w:p>
       <w:pPr>
@@ -2213,19 +3014,61 @@
         <w:rPr>
           <w:lang w:val="es-419"/>
         </w:rPr>
-        <w:t>¿Qué cambios percibe en el tiempo de ejecución al modificar el esquema de colisiones?</w:t>
-      </w:r>
-      <w:r>
-        <w:rPr>
-          <w:lang w:val="es-419"/>
-        </w:rPr>
-        <w:t xml:space="preserve"> S</w:t>
-      </w:r>
-      <w:r>
-        <w:rPr>
-          <w:lang w:val="es-419"/>
-        </w:rPr>
-        <w:t>i los percibe, describa las diferencias y argumente su respuesta.</w:t>
+        <w:t>¿Qué cambios percibe en el consumo de memoria al modificar el factor de carga máximo?</w:t>
+      </w:r>
+    </w:p>
+    <w:p>
+      <w:pPr>
+        <w:pStyle w:val="Prrafodelista"/>
+        <w:ind w:left="360"/>
+        <w:jc w:val="both"/>
+        <w:rPr>
+          <w:lang w:val="es-419"/>
+        </w:rPr>
+      </w:pPr>
+    </w:p>
+    <w:p>
+      <w:pPr>
+        <w:pStyle w:val="Prrafodelista"/>
+        <w:ind w:left="360"/>
+        <w:jc w:val="both"/>
+        <w:rPr>
+          <w:lang w:val="es-CO"/>
+        </w:rPr>
+      </w:pPr>
+      <w:r>
+        <w:rPr>
+          <w:lang w:val="es-CO"/>
+        </w:rPr>
+        <w:t xml:space="preserve">En </w:t>
+      </w:r>
+      <w:proofErr w:type="spellStart"/>
+      <w:r>
+        <w:rPr>
+          <w:lang w:val="es-CO"/>
+        </w:rPr>
+        <w:t>probing</w:t>
+      </w:r>
+      <w:proofErr w:type="spellEnd"/>
+      <w:r>
+        <w:rPr>
+          <w:lang w:val="es-CO"/>
+        </w:rPr>
+        <w:t xml:space="preserve">, la memoria baja mucho al subir el factor (de 724.194 kB a 393.285 kB), porque hay menos casillas vacías. En </w:t>
+      </w:r>
+      <w:proofErr w:type="spellStart"/>
+      <w:r>
+        <w:rPr>
+          <w:lang w:val="es-CO"/>
+        </w:rPr>
+        <w:t>chaining</w:t>
+      </w:r>
+      <w:proofErr w:type="spellEnd"/>
+      <w:r>
+        <w:rPr>
+          <w:lang w:val="es-CO"/>
+        </w:rPr>
+        <w:t xml:space="preserve"> casi no cambia (de 409.416 kB a 395.228 kB), porque cada elemento ocupa un nodo sin importar el factor.</w:t>
       </w:r>
     </w:p>
     <w:p>
@@ -2252,6 +3095,121 @@
         <w:rPr>
           <w:lang w:val="es-419"/>
         </w:rPr>
+        <w:t>¿Qué cambios percibe en el tiempo de ejecución al modificar el esquema de colisiones?</w:t>
+      </w:r>
+      <w:r>
+        <w:rPr>
+          <w:lang w:val="es-419"/>
+        </w:rPr>
+        <w:t xml:space="preserve"> S</w:t>
+      </w:r>
+      <w:r>
+        <w:rPr>
+          <w:lang w:val="es-419"/>
+        </w:rPr>
+        <w:t>i los percibe, describa las diferencias y argumente su respuesta.</w:t>
+      </w:r>
+    </w:p>
+    <w:p>
+      <w:pPr>
+        <w:pStyle w:val="Prrafodelista"/>
+        <w:ind w:left="360"/>
+        <w:jc w:val="both"/>
+        <w:rPr>
+          <w:lang w:val="es-419"/>
+        </w:rPr>
+      </w:pPr>
+    </w:p>
+    <w:p>
+      <w:pPr>
+        <w:pStyle w:val="Prrafodelista"/>
+        <w:ind w:left="360"/>
+        <w:jc w:val="both"/>
+        <w:rPr>
+          <w:lang w:val="es-419"/>
+        </w:rPr>
+      </w:pPr>
+      <w:proofErr w:type="spellStart"/>
+      <w:r>
+        <w:rPr>
+          <w:lang w:val="es-CO"/>
+        </w:rPr>
+        <w:t>Chaining</w:t>
+      </w:r>
+      <w:proofErr w:type="spellEnd"/>
+      <w:r>
+        <w:rPr>
+          <w:lang w:val="es-CO"/>
+        </w:rPr>
+        <w:t xml:space="preserve"> con factor 2 fue el más rápido (5.106 ms frente a 6.574 ms, el mejor de </w:t>
+      </w:r>
+      <w:proofErr w:type="spellStart"/>
+      <w:r>
+        <w:rPr>
+          <w:lang w:val="es-CO"/>
+        </w:rPr>
+        <w:t>probing</w:t>
+      </w:r>
+      <w:proofErr w:type="spellEnd"/>
+      <w:r>
+        <w:rPr>
+          <w:lang w:val="es-CO"/>
+        </w:rPr>
+        <w:t xml:space="preserve">), porque solo recorre la lista de su casilla, mientras que </w:t>
+      </w:r>
+      <w:proofErr w:type="spellStart"/>
+      <w:r>
+        <w:rPr>
+          <w:lang w:val="es-CO"/>
+        </w:rPr>
+        <w:t>probing</w:t>
+      </w:r>
+      <w:proofErr w:type="spellEnd"/>
+      <w:r>
+        <w:rPr>
+          <w:lang w:val="es-CO"/>
+        </w:rPr>
+        <w:t xml:space="preserve"> revisa casillas vecinas al haber colisiones. Con factores altos, </w:t>
+      </w:r>
+      <w:proofErr w:type="spellStart"/>
+      <w:r>
+        <w:rPr>
+          <w:lang w:val="es-CO"/>
+        </w:rPr>
+        <w:t>chaining</w:t>
+      </w:r>
+      <w:proofErr w:type="spellEnd"/>
+      <w:r>
+        <w:rPr>
+          <w:lang w:val="es-CO"/>
+        </w:rPr>
+        <w:t xml:space="preserve"> se vuelve más lento por sus listas largas.</w:t>
+      </w:r>
+    </w:p>
+    <w:p>
+      <w:pPr>
+        <w:pStyle w:val="Prrafodelista"/>
+        <w:rPr>
+          <w:lang w:val="es-419"/>
+        </w:rPr>
+      </w:pPr>
+    </w:p>
+    <w:p>
+      <w:pPr>
+        <w:pStyle w:val="Prrafodelista"/>
+        <w:numPr>
+          <w:ilvl w:val="0"/>
+          <w:numId w:val="13"/>
+        </w:numPr>
+        <w:jc w:val="both"/>
+        <w:rPr>
+          <w:lang w:val="es-419"/>
+        </w:rPr>
+      </w:pPr>
+      <w:r>
+        <w:rPr>
+          <w:lang w:val="es-419"/>
+        </w:rPr>
         <w:t>¿Qué cambios percibe en el consumo de memoria al modificar el esquema de colisiones?</w:t>
       </w:r>
       <w:r>
@@ -2265,6 +3223,60 @@
           <w:lang w:val="es-419"/>
         </w:rPr>
         <w:t>i los percibe, describa las diferencias y argumente su respuesta.</w:t>
+      </w:r>
+    </w:p>
+    <w:p>
+      <w:pPr>
+        <w:pStyle w:val="Prrafodelista"/>
+        <w:ind w:left="360"/>
+        <w:jc w:val="both"/>
+        <w:rPr>
+          <w:lang w:val="es-419"/>
+        </w:rPr>
+      </w:pPr>
+    </w:p>
+    <w:p>
+      <w:pPr>
+        <w:pStyle w:val="Prrafodelista"/>
+        <w:ind w:left="360"/>
+        <w:jc w:val="both"/>
+        <w:rPr>
+          <w:lang w:val="es-CO"/>
+        </w:rPr>
+      </w:pPr>
+      <w:r>
+        <w:rPr>
+          <w:lang w:val="es-CO"/>
+        </w:rPr>
+        <w:t xml:space="preserve">Con factores altos, los dos usan memoria parecida (unos 395.000 kB). La diferencia es que </w:t>
+      </w:r>
+      <w:proofErr w:type="spellStart"/>
+      <w:r>
+        <w:rPr>
+          <w:lang w:val="es-CO"/>
+        </w:rPr>
+        <w:t>probing</w:t>
+      </w:r>
+      <w:proofErr w:type="spellEnd"/>
+      <w:r>
+        <w:rPr>
+          <w:lang w:val="es-CO"/>
+        </w:rPr>
+        <w:t xml:space="preserve"> desperdicia mucha memoria con factores bajos (724.194 kB con 0,1), mientras que </w:t>
+      </w:r>
+      <w:proofErr w:type="spellStart"/>
+      <w:r>
+        <w:rPr>
+          <w:lang w:val="es-CO"/>
+        </w:rPr>
+        <w:t>chaining</w:t>
+      </w:r>
+      <w:proofErr w:type="spellEnd"/>
+      <w:r>
+        <w:rPr>
+          <w:lang w:val="es-CO"/>
+        </w:rPr>
+        <w:t xml:space="preserve"> se mantiene estable porque solo crea nodos para los elementos que existen.</w:t>
       </w:r>
     </w:p>
     <w:p>
@@ -4216,7 +5228,6 @@
   <w:style w:type="character" w:default="1" w:styleId="Fuentedeprrafopredeter">
     <w:name w:val="Default Paragraph Font"/>
     <w:uiPriority w:val="1"/>
-    <w:semiHidden/>
     <w:unhideWhenUsed/>
   </w:style>
   <w:style w:type="table" w:default="1" w:styleId="Tablanormal">
@@ -4802,6 +5813,26 @@
 </file>
 
 <file path=customXml/item1.xml><?xml version="1.0" encoding="utf-8"?>
+<p:properties xmlns:p="http://schemas.microsoft.com/office/2006/metadata/properties" xmlns:xsi="http://www.w3.org/2001/XMLSchema-instance" xmlns:pc="http://schemas.microsoft.com/office/infopath/2007/PartnerControls">
+  <documentManagement>
+    <TaxCatchAll xmlns="85e30bcc-d76c-4413-8e4d-2dce22fb0743" xsi:nil="true"/>
+    <lcf76f155ced4ddcb4097134ff3c332f xmlns="164883f8-7691-4ecf-b54a-664c0d0edefe">
+      <Terms xmlns="http://schemas.microsoft.com/office/infopath/2007/PartnerControls"/>
+    </lcf76f155ced4ddcb4097134ff3c332f>
+  </documentManagement>
+</p:properties>
+</file>
+
+<file path=customXml/item2.xml><?xml version="1.0" encoding="utf-8"?>
+<?mso-contentType ?>
+<FormTemplates xmlns="http://schemas.microsoft.com/sharepoint/v3/contenttype/forms">
+  <Display>DocumentLibraryForm</Display>
+  <Edit>DocumentLibraryForm</Edit>
+  <New>DocumentLibraryForm</New>
+</FormTemplates>
+</file>
+
+<file path=customXml/item3.xml><?xml version="1.0" encoding="utf-8"?>
 <ct:contentTypeSchema xmlns:ct="http://schemas.microsoft.com/office/2006/metadata/contentType" xmlns:ma="http://schemas.microsoft.com/office/2006/metadata/properties/metaAttributes" ct:_="" ma:_="" ma:contentTypeName="Documento" ma:contentTypeID="0x01010023858CF01A2EF24688B692775F4C60A4" ma:contentTypeVersion="17" ma:contentTypeDescription="Crear nuevo documento." ma:contentTypeScope="" ma:versionID="af74a0f8eb440a60883e9dd833f0742f">
   <xsd:schema xmlns:xsd="http://www.w3.org/2001/XMLSchema" xmlns:xs="http://www.w3.org/2001/XMLSchema" xmlns:p="http://schemas.microsoft.com/office/2006/metadata/properties" xmlns:ns2="164883f8-7691-4ecf-b54a-664c0d0edefe" xmlns:ns3="85e30bcc-d76c-4413-8e4d-2dce22fb0743" targetNamespace="http://schemas.microsoft.com/office/2006/metadata/properties" ma:root="true" ma:fieldsID="f5ceeff32ffca1089660572a8ebd1782" ns2:_="" ns3:_="">
     <xsd:import namespace="164883f8-7691-4ecf-b54a-664c0d0edefe"/>
@@ -5050,27 +6081,26 @@
 </ct:contentTypeSchema>
 </file>
 
-<file path=customXml/item2.xml><?xml version="1.0" encoding="utf-8"?>
-<?mso-contentType ?>
-<FormTemplates xmlns="http://schemas.microsoft.com/sharepoint/v3/contenttype/forms">
-  <Display>DocumentLibraryForm</Display>
-  <Edit>DocumentLibraryForm</Edit>
-  <New>DocumentLibraryForm</New>
-</FormTemplates>
+<file path=customXml/itemProps1.xml><?xml version="1.0" encoding="utf-8"?>
+<ds:datastoreItem xmlns:ds="http://schemas.openxmlformats.org/officeDocument/2006/customXml" ds:itemID="{8542EACB-7939-45C8-99C3-B6897CA7A7EF}">
+  <ds:schemaRefs>
+    <ds:schemaRef ds:uri="http://schemas.microsoft.com/office/2006/metadata/properties"/>
+    <ds:schemaRef ds:uri="http://schemas.microsoft.com/office/infopath/2007/PartnerControls"/>
+    <ds:schemaRef ds:uri="85e30bcc-d76c-4413-8e4d-2dce22fb0743"/>
+    <ds:schemaRef ds:uri="164883f8-7691-4ecf-b54a-664c0d0edefe"/>
+  </ds:schemaRefs>
+</ds:datastoreItem>
 </file>
 
-<file path=customXml/item3.xml><?xml version="1.0" encoding="utf-8"?>
-<p:properties xmlns:p="http://schemas.microsoft.com/office/2006/metadata/properties" xmlns:xsi="http://www.w3.org/2001/XMLSchema-instance" xmlns:pc="http://schemas.microsoft.com/office/infopath/2007/PartnerControls">
-  <documentManagement>
-    <TaxCatchAll xmlns="85e30bcc-d76c-4413-8e4d-2dce22fb0743" xsi:nil="true"/>
-    <lcf76f155ced4ddcb4097134ff3c332f xmlns="164883f8-7691-4ecf-b54a-664c0d0edefe">
-      <Terms xmlns="http://schemas.microsoft.com/office/infopath/2007/PartnerControls"/>
-    </lcf76f155ced4ddcb4097134ff3c332f>
-  </documentManagement>
-</p:properties>
+<file path=customXml/itemProps2.xml><?xml version="1.0" encoding="utf-8"?>
+<ds:datastoreItem xmlns:ds="http://schemas.openxmlformats.org/officeDocument/2006/customXml" ds:itemID="{1F59EA8B-1FA8-40D2-A8B0-61B9CE1E4579}">
+  <ds:schemaRefs>
+    <ds:schemaRef ds:uri="http://schemas.microsoft.com/sharepoint/v3/contenttype/forms"/>
+  </ds:schemaRefs>
+</ds:datastoreItem>
 </file>
 
-<file path=customXml/itemProps1.xml><?xml version="1.0" encoding="utf-8"?>
+<file path=customXml/itemProps3.xml><?xml version="1.0" encoding="utf-8"?>
 <ds:datastoreItem xmlns:ds="http://schemas.openxmlformats.org/officeDocument/2006/customXml" ds:itemID="{3D061157-43BE-4FE1-9C39-AC4CA83D3705}">
   <ds:schemaRefs>
     <ds:schemaRef ds:uri="http://schemas.microsoft.com/office/2006/metadata/contentType"/>
@@ -5087,23 +6117,4 @@
     <ds:schemaRef ds:uri="http://schemas.microsoft.com/internal/obd"/>
   </ds:schemaRefs>
 </ds:datastoreItem>
-</file>
-
-<file path=customXml/itemProps2.xml><?xml version="1.0" encoding="utf-8"?>
-<ds:datastoreItem xmlns:ds="http://schemas.openxmlformats.org/officeDocument/2006/customXml" ds:itemID="{1F59EA8B-1FA8-40D2-A8B0-61B9CE1E4579}">
-  <ds:schemaRefs>
-    <ds:schemaRef ds:uri="http://schemas.microsoft.com/sharepoint/v3/contenttype/forms"/>
-  </ds:schemaRefs>
-</ds:datastoreItem>
-</file>
-
-<file path=customXml/itemProps3.xml><?xml version="1.0" encoding="utf-8"?>
-<ds:datastoreItem xmlns:ds="http://schemas.openxmlformats.org/officeDocument/2006/customXml" ds:itemID="{8542EACB-7939-45C8-99C3-B6897CA7A7EF}">
-  <ds:schemaRefs>
-    <ds:schemaRef ds:uri="http://schemas.microsoft.com/office/2006/metadata/properties"/>
-    <ds:schemaRef ds:uri="http://schemas.microsoft.com/office/infopath/2007/PartnerControls"/>
-    <ds:schemaRef ds:uri="85e30bcc-d76c-4413-8e4d-2dce22fb0743"/>
-    <ds:schemaRef ds:uri="164883f8-7691-4ecf-b54a-664c0d0edefe"/>
-  </ds:schemaRefs>
-</ds:datastoreItem>
 </file>
</xml_diff>